<commit_message>
Add modular paint-over and ID-map colours
- docs/mill-alley-paintover.png: perspective module grid with hero outlines and
  a 180 cm scale figure, plus a colour ID map of the kit (scripts/idmap.py)
- ID colours shared by the app (src/data/colors.ts swatches on Kit, Heroes,
  Asset pages; paint-over on Reference page) and the tracker spreadsheet
  (column H + Paint-over sheet, scripts/build_xlsx.py)
- Plan document (Word/PDF) includes the paint-over

Co-Authored-By: Claude Opus 5.5 <noreply@anthropic.com>
Claude-Session: https://claude.ai/code/session_01BBz4kUXe8DBQeVKEZD3dJv
</commit_message>
<xml_diff>
--- a/docs/Derelict-Mill-Alley-Plan.docx
+++ b/docs/Derelict-Mill-Alley-Plan.docx
@@ -2,7 +2,7 @@
 <file path=word/document.xml><?xml version="1.0" encoding="utf-8"?>
 <w:document xmlns:w="http://schemas.openxmlformats.org/wordprocessingml/2006/main" xmlns:m="http://schemas.openxmlformats.org/officeDocument/2006/math" xmlns:r="http://schemas.openxmlformats.org/officeDocument/2006/relationships" xmlns:o="urn:schemas-microsoft-com:office:office" xmlns:v="urn:schemas-microsoft-com:vml" xmlns:w10="urn:schemas-microsoft-com:office:word" xmlns:a="http://schemas.openxmlformats.org/drawingml/2006/main" xmlns:pic="http://schemas.openxmlformats.org/drawingml/2006/picture" xmlns:wp="http://schemas.openxmlformats.org/drawingml/2006/wordprocessingDrawing">
   <w:body>
-    <w:bookmarkStart w:id="62" w:name="X1a4667074e1879bc9532df4ad099b2368c3776c"/>
+    <w:bookmarkStart w:id="65" w:name="X1a4667074e1879bc9532df4ad099b2368c3776c"/>
     <w:p>
       <w:pPr>
         <w:pStyle w:val="Heading1"/>
@@ -289,7 +289,7 @@
       </w:r>
     </w:p>
     <w:bookmarkEnd w:id="20"/>
-    <w:bookmarkStart w:id="24" w:name="reference-breakdown-and-11-scale"/>
+    <w:bookmarkStart w:id="27" w:name="reference-breakdown-and-11-scale"/>
     <w:p>
       <w:pPr>
         <w:pStyle w:val="Heading2"/>
@@ -2392,8 +2392,83 @@
         <w:t xml:space="preserve">Brick tiling texture covers 200 x 200 cm with 24 courses (8.33 cm each, a small cheat on the real 8.6) so coursing lines up at every 100 cm module edge.</w:t>
       </w:r>
     </w:p>
-    <w:bookmarkEnd w:id="24"/>
-    <w:bookmarkStart w:id="25" w:name="modular-kit"/>
+    <w:p>
+      <w:pPr>
+        <w:pStyle w:val="FirstParagraph"/>
+      </w:pPr>
+      <w:r>
+        <w:rPr>
+          <w:bCs/>
+          <w:b/>
+        </w:rPr>
+        <w:t xml:space="preserve">Modular paint-over</w:t>
+      </w:r>
+    </w:p>
+    <w:p>
+      <w:pPr>
+        <w:pStyle w:val="CaptionedFigure"/>
+      </w:pPr>
+      <w:r>
+        <w:drawing>
+          <wp:inline>
+            <wp:extent cx="5334000" cy="3675673"/>
+            <wp:effectExtent b="0" l="0" r="0" t="0"/>
+            <wp:docPr descr="Modular paint-over" title="" id="25" name="Picture"/>
+            <a:graphic>
+              <a:graphicData uri="http://schemas.openxmlformats.org/drawingml/2006/picture">
+                <pic:pic>
+                  <pic:nvPicPr>
+                    <pic:cNvPr descr="paint/mill-alley-paintover.png" id="26" name="Picture"/>
+                    <pic:cNvPicPr>
+                      <a:picLocks noChangeArrowheads="1" noChangeAspect="1"/>
+                    </pic:cNvPicPr>
+                  </pic:nvPicPr>
+                  <pic:blipFill>
+                    <a:blip r:embed="rId24"/>
+                    <a:stretch>
+                      <a:fillRect/>
+                    </a:stretch>
+                  </pic:blipFill>
+                  <pic:spPr bwMode="auto">
+                    <a:xfrm>
+                      <a:off x="0" y="0"/>
+                      <a:ext cx="5334000" cy="3675673"/>
+                    </a:xfrm>
+                    <a:prstGeom prst="rect">
+                      <a:avLst/>
+                    </a:prstGeom>
+                    <a:noFill/>
+                    <a:ln w="9525">
+                      <a:noFill/>
+                      <a:headEnd/>
+                      <a:tailEnd/>
+                    </a:ln>
+                  </pic:spPr>
+                </pic:pic>
+              </a:graphicData>
+            </a:graphic>
+          </wp:inline>
+        </w:drawing>
+      </w:r>
+    </w:p>
+    <w:p>
+      <w:pPr>
+        <w:pStyle w:val="ImageCaption"/>
+      </w:pPr>
+      <w:r>
+        <w:t xml:space="preserve">Modular paint-over</w:t>
+      </w:r>
+    </w:p>
+    <w:p>
+      <w:pPr>
+        <w:pStyle w:val="BodyText"/>
+      </w:pPr>
+      <w:r>
+        <w:t xml:space="preserve">Left: the perspective module grid (400 cm modules on the left wall, 300 × 380 cm bays on the right), hero outlines H1 to H7 and a 180 cm figure for scale. Right: the ID map, one colour per kit piece. The same colours are the swatches in column H of the tracker spreadsheet; pieces not visible in the photo (A06, A08, B08, B09, C03, C04, C06, D02, D03, D05 to D07) have colours reserved for later ID maps.</w:t>
+      </w:r>
+    </w:p>
+    <w:bookmarkEnd w:id="27"/>
+    <w:bookmarkStart w:id="28" w:name="modular-kit"/>
     <w:p>
       <w:pPr>
         <w:pStyle w:val="Heading2"/>
@@ -5188,8 +5263,8 @@
         <w:t xml:space="preserve">T03 Timber: boards, door planks, skybridge cladding strips, window mullions.</w:t>
       </w:r>
     </w:p>
-    <w:bookmarkEnd w:id="25"/>
-    <w:bookmarkStart w:id="26" w:name="unique-hero-features"/>
+    <w:bookmarkEnd w:id="28"/>
+    <w:bookmarkStart w:id="29" w:name="unique-hero-features"/>
     <w:p>
       <w:pPr>
         <w:pStyle w:val="Heading2"/>
@@ -5799,8 +5874,8 @@
         </w:tc>
       </w:tr>
     </w:tbl>
-    <w:bookmarkEnd w:id="26"/>
-    <w:bookmarkStart w:id="27" w:name="full-asset-list"/>
+    <w:bookmarkEnd w:id="29"/>
+    <w:bookmarkStart w:id="30" w:name="full-asset-list"/>
     <w:p>
       <w:pPr>
         <w:pStyle w:val="Heading2"/>
@@ -10956,8 +11031,8 @@
         </w:tc>
       </w:tr>
     </w:tbl>
-    <w:bookmarkEnd w:id="27"/>
-    <w:bookmarkStart w:id="28" w:name="materials-and-texture-plan"/>
+    <w:bookmarkEnd w:id="30"/>
+    <w:bookmarkStart w:id="31" w:name="materials-and-texture-plan"/>
     <w:p>
       <w:pPr>
         <w:pStyle w:val="Heading2"/>
@@ -11943,8 +12018,8 @@
         <w:t xml:space="preserve">Prop atlases: bricks, litter, paper, slates at 1K to 2K each.</w:t>
       </w:r>
     </w:p>
-    <w:bookmarkEnd w:id="28"/>
-    <w:bookmarkStart w:id="47" w:name="daily-schedule"/>
+    <w:bookmarkEnd w:id="31"/>
+    <w:bookmarkStart w:id="50" w:name="daily-schedule"/>
     <w:p>
       <w:pPr>
         <w:pStyle w:val="Heading2"/>
@@ -11970,18 +12045,18 @@
           <wp:inline>
             <wp:extent cx="5334000" cy="2773680"/>
             <wp:effectExtent b="0" l="0" r="0" t="0"/>
-            <wp:docPr descr="Production timeline" title="" id="30" name="Picture"/>
+            <wp:docPr descr="Production timeline" title="" id="33" name="Picture"/>
             <a:graphic>
               <a:graphicData uri="http://schemas.openxmlformats.org/drawingml/2006/picture">
                 <pic:pic>
                   <pic:nvPicPr>
-                    <pic:cNvPr descr="timeline.png" id="31" name="Picture"/>
+                    <pic:cNvPr descr="timeline.png" id="34" name="Picture"/>
                     <pic:cNvPicPr>
                       <a:picLocks noChangeArrowheads="1" noChangeAspect="1"/>
                     </pic:cNvPicPr>
                   </pic:nvPicPr>
                   <pic:blipFill>
-                    <a:blip r:embed="rId29"/>
+                    <a:blip r:embed="rId32"/>
                     <a:stretch>
                       <a:fillRect/>
                     </a:stretch>
@@ -12024,7 +12099,7 @@
         <w:t xml:space="preserve">The kit is done by Sun Nov 22, so everything after it builds on locked metrics; set dressing absorbs the two holiday weeks.</w:t>
       </w:r>
     </w:p>
-    <w:bookmarkStart w:id="32" w:name="week-1-oct-19-to-25-pre-production"/>
+    <w:bookmarkStart w:id="35" w:name="week-1-oct-19-to-25-pre-production"/>
     <w:p>
       <w:pPr>
         <w:pStyle w:val="Heading3"/>
@@ -12253,8 +12328,8 @@
         <w:t xml:space="preserve">target image saved next to the reference.</w:t>
       </w:r>
     </w:p>
-    <w:bookmarkEnd w:id="32"/>
-    <w:bookmarkStart w:id="33" w:name="week-2-oct-26-to-nov-1-greybox"/>
+    <w:bookmarkEnd w:id="35"/>
+    <w:bookmarkStart w:id="36" w:name="week-2-oct-26-to-nov-1-greybox"/>
     <w:p>
       <w:pPr>
         <w:pStyle w:val="Heading3"/>
@@ -12483,8 +12558,8 @@
         <w:t xml:space="preserve">side-by-side greybox vs reference.</w:t>
       </w:r>
     </w:p>
-    <w:bookmarkEnd w:id="33"/>
-    <w:bookmarkStart w:id="34" w:name="week-3-nov-2-to-8-tiling-materials"/>
+    <w:bookmarkEnd w:id="36"/>
+    <w:bookmarkStart w:id="37" w:name="week-3-nov-2-to-8-tiling-materials"/>
     <w:p>
       <w:pPr>
         <w:pStyle w:val="Heading3"/>
@@ -12728,8 +12803,8 @@
         <w:t xml:space="preserve">painting moss, grime and wet works.</w:t>
       </w:r>
     </w:p>
-    <w:bookmarkEnd w:id="34"/>
-    <w:bookmarkStart w:id="35" w:name="X32ea748068bb758f1e5c59701b077139c2b0214"/>
+    <w:bookmarkEnd w:id="37"/>
+    <w:bookmarkStart w:id="38" w:name="X32ea748068bb758f1e5c59701b077139c2b0214"/>
     <w:p>
       <w:pPr>
         <w:pStyle w:val="Heading3"/>
@@ -12970,8 +13045,8 @@
         <w:t xml:space="preserve">left wall fully kit-built.</w:t>
       </w:r>
     </w:p>
-    <w:bookmarkEnd w:id="35"/>
-    <w:bookmarkStart w:id="36" w:name="week-5-nov-16-to-22-families-b-c-and-d"/>
+    <w:bookmarkEnd w:id="38"/>
+    <w:bookmarkStart w:id="39" w:name="week-5-nov-16-to-22-families-b-c-and-d"/>
     <w:p>
       <w:pPr>
         <w:pStyle w:val="Heading3"/>
@@ -13200,8 +13275,8 @@
         <w:t xml:space="preserve">the alley is 100% kit.</w:t>
       </w:r>
     </w:p>
-    <w:bookmarkEnd w:id="36"/>
-    <w:bookmarkStart w:id="37" w:name="week-6-nov-23-to-29-hero-skybridge-h1"/>
+    <w:bookmarkEnd w:id="39"/>
+    <w:bookmarkStart w:id="40" w:name="week-6-nov-23-to-29-hero-skybridge-h1"/>
     <w:p>
       <w:pPr>
         <w:pStyle w:val="Heading3"/>
@@ -13430,8 +13505,8 @@
         <w:t xml:space="preserve">skybridge final in Camera 1.</w:t>
       </w:r>
     </w:p>
-    <w:bookmarkEnd w:id="37"/>
-    <w:bookmarkStart w:id="38" w:name="X2c0625dfe6827ef1b9e324fcea41b65c90ce437"/>
+    <w:bookmarkEnd w:id="40"/>
+    <w:bookmarkStart w:id="41" w:name="X2c0625dfe6827ef1b9e324fcea41b65c90ce437"/>
     <w:p>
       <w:pPr>
         <w:pStyle w:val="Heading3"/>
@@ -13640,8 +13715,8 @@
         <w:t xml:space="preserve">· Buffer.</w:t>
       </w:r>
     </w:p>
-    <w:bookmarkEnd w:id="38"/>
-    <w:bookmarkStart w:id="39" w:name="week-8-dec-7-to-13-props-and-debris"/>
+    <w:bookmarkEnd w:id="41"/>
+    <w:bookmarkStart w:id="42" w:name="week-8-dec-7-to-13-props-and-debris"/>
     <w:p>
       <w:pPr>
         <w:pStyle w:val="Heading3"/>
@@ -13870,8 +13945,8 @@
         <w:t xml:space="preserve">prop gallery screenshot.</w:t>
       </w:r>
     </w:p>
-    <w:bookmarkEnd w:id="39"/>
-    <w:bookmarkStart w:id="40" w:name="week-9-dec-14-to-20-foliage"/>
+    <w:bookmarkEnd w:id="42"/>
+    <w:bookmarkStart w:id="43" w:name="week-9-dec-14-to-20-foliage"/>
     <w:p>
       <w:pPr>
         <w:pStyle w:val="Heading3"/>
@@ -14100,8 +14175,8 @@
         <w:t xml:space="preserve">far end reads bright and green.</w:t>
       </w:r>
     </w:p>
-    <w:bookmarkEnd w:id="40"/>
-    <w:bookmarkStart w:id="41" w:name="Xd02929971d681b6e72f4bd959f3f1ec853c70bf"/>
+    <w:bookmarkEnd w:id="43"/>
+    <w:bookmarkStart w:id="44" w:name="Xd02929971d681b6e72f4bd959f3f1ec853c70bf"/>
     <w:p>
       <w:pPr>
         <w:pStyle w:val="Heading3"/>
@@ -14326,8 +14401,8 @@
         <w:t xml:space="preserve">every sill and pipe has a story and the fix list is written.</w:t>
       </w:r>
     </w:p>
-    <w:bookmarkEnd w:id="41"/>
-    <w:bookmarkStart w:id="42" w:name="week-11-dec-28-to-jan-3-set-dressing"/>
+    <w:bookmarkEnd w:id="44"/>
+    <w:bookmarkStart w:id="45" w:name="week-11-dec-28-to-jan-3-set-dressing"/>
     <w:p>
       <w:pPr>
         <w:pStyle w:val="Heading3"/>
@@ -14524,8 +14599,8 @@
         <w:t xml:space="preserve">· Buffer.</w:t>
       </w:r>
     </w:p>
-    <w:bookmarkEnd w:id="42"/>
-    <w:bookmarkStart w:id="43" w:name="Xe7de45812c0e68c099e2685143e7a6eb7633920"/>
+    <w:bookmarkEnd w:id="45"/>
+    <w:bookmarkStart w:id="46" w:name="Xe7de45812c0e68c099e2685143e7a6eb7633920"/>
     <w:p>
       <w:pPr>
         <w:pStyle w:val="Heading3"/>
@@ -14722,8 +14797,8 @@
         <w:t xml:space="preserve">· Buffer.</w:t>
       </w:r>
     </w:p>
-    <w:bookmarkEnd w:id="43"/>
-    <w:bookmarkStart w:id="44" w:name="Xa6049d370efa67530d1c0021220da960b05be17"/>
+    <w:bookmarkEnd w:id="46"/>
+    <w:bookmarkStart w:id="47" w:name="Xa6049d370efa67530d1c0021220da960b05be17"/>
     <w:p>
       <w:pPr>
         <w:pStyle w:val="Heading3"/>
@@ -14952,8 +15027,8 @@
         <w:t xml:space="preserve">critique notes collected.</w:t>
       </w:r>
     </w:p>
-    <w:bookmarkEnd w:id="44"/>
-    <w:bookmarkStart w:id="45" w:name="X2022b050459a90e50d8e2e1db32a6c5a794b334"/>
+    <w:bookmarkEnd w:id="47"/>
+    <w:bookmarkStart w:id="48" w:name="X2022b050459a90e50d8e2e1db32a6c5a794b334"/>
     <w:p>
       <w:pPr>
         <w:pStyle w:val="Heading3"/>
@@ -15182,8 +15257,8 @@
         <w:t xml:space="preserve">scene locked.</w:t>
       </w:r>
     </w:p>
-    <w:bookmarkEnd w:id="45"/>
-    <w:bookmarkStart w:id="46" w:name="week-15-jan-25-to-31-final-renders"/>
+    <w:bookmarkEnd w:id="48"/>
+    <w:bookmarkStart w:id="49" w:name="week-15-jan-25-to-31-final-renders"/>
     <w:p>
       <w:pPr>
         <w:pStyle w:val="Heading3"/>
@@ -15412,9 +15487,9 @@
         <w:t xml:space="preserve">project is live.</w:t>
       </w:r>
     </w:p>
-    <w:bookmarkEnd w:id="46"/>
-    <w:bookmarkEnd w:id="47"/>
-    <w:bookmarkStart w:id="60" w:name="free-resources"/>
+    <w:bookmarkEnd w:id="49"/>
+    <w:bookmarkEnd w:id="50"/>
+    <w:bookmarkStart w:id="63" w:name="free-resources"/>
     <w:p>
       <w:pPr>
         <w:pStyle w:val="Heading2"/>
@@ -15525,7 +15600,7 @@
               <w:spacing w:after="20" w:before="20"/>
               <w:jc w:val="left"/>
             </w:pPr>
-            <w:hyperlink r:id="rId48">
+            <w:hyperlink r:id="rId51">
               <w:r>
                 <w:rPr>
                   <w:rStyle w:val="Hyperlink"/>
@@ -15579,7 +15654,7 @@
               <w:spacing w:after="20" w:before="20"/>
               <w:jc w:val="left"/>
             </w:pPr>
-            <w:hyperlink r:id="rId49">
+            <w:hyperlink r:id="rId52">
               <w:r>
                 <w:rPr>
                   <w:rStyle w:val="Hyperlink"/>
@@ -15635,7 +15710,7 @@
               <w:spacing w:after="20" w:before="20"/>
               <w:jc w:val="left"/>
             </w:pPr>
-            <w:hyperlink r:id="rId50">
+            <w:hyperlink r:id="rId53">
               <w:r>
                 <w:rPr>
                   <w:rStyle w:val="Hyperlink"/>
@@ -15701,7 +15776,7 @@
               <w:spacing w:after="20" w:before="20"/>
               <w:jc w:val="left"/>
             </w:pPr>
-            <w:hyperlink r:id="rId51">
+            <w:hyperlink r:id="rId54">
               <w:r>
                 <w:rPr>
                   <w:rStyle w:val="Hyperlink"/>
@@ -15757,7 +15832,7 @@
               <w:spacing w:after="20" w:before="20"/>
               <w:jc w:val="left"/>
             </w:pPr>
-            <w:hyperlink r:id="rId52">
+            <w:hyperlink r:id="rId55">
               <w:r>
                 <w:rPr>
                   <w:rStyle w:val="Hyperlink"/>
@@ -15811,7 +15886,7 @@
               <w:spacing w:after="20" w:before="20"/>
               <w:jc w:val="left"/>
             </w:pPr>
-            <w:hyperlink r:id="rId53">
+            <w:hyperlink r:id="rId56">
               <w:r>
                 <w:rPr>
                   <w:rStyle w:val="Hyperlink"/>
@@ -15867,7 +15942,7 @@
               <w:spacing w:after="20" w:before="20"/>
               <w:jc w:val="left"/>
             </w:pPr>
-            <w:hyperlink r:id="rId54">
+            <w:hyperlink r:id="rId57">
               <w:r>
                 <w:rPr>
                   <w:rStyle w:val="Hyperlink"/>
@@ -15975,7 +16050,7 @@
               <w:spacing w:after="20" w:before="20"/>
               <w:jc w:val="left"/>
             </w:pPr>
-            <w:hyperlink r:id="rId55">
+            <w:hyperlink r:id="rId58">
               <w:r>
                 <w:rPr>
                   <w:rStyle w:val="Hyperlink"/>
@@ -16029,7 +16104,7 @@
       <w:r>
         <w:t xml:space="preserve"> </w:t>
       </w:r>
-      <w:hyperlink r:id="rId56">
+      <w:hyperlink r:id="rId59">
         <w:r>
           <w:rPr>
             <w:rStyle w:val="Hyperlink"/>
@@ -16043,7 +16118,7 @@
       <w:r>
         <w:t xml:space="preserve"> </w:t>
       </w:r>
-      <w:hyperlink r:id="rId57">
+      <w:hyperlink r:id="rId60">
         <w:r>
           <w:rPr>
             <w:rStyle w:val="Hyperlink"/>
@@ -16057,7 +16132,7 @@
       <w:r>
         <w:t xml:space="preserve"> </w:t>
       </w:r>
-      <w:hyperlink r:id="rId58">
+      <w:hyperlink r:id="rId61">
         <w:r>
           <w:rPr>
             <w:rStyle w:val="Hyperlink"/>
@@ -16071,7 +16146,7 @@
       <w:r>
         <w:t xml:space="preserve"> </w:t>
       </w:r>
-      <w:hyperlink r:id="rId59">
+      <w:hyperlink r:id="rId62">
         <w:r>
           <w:rPr>
             <w:rStyle w:val="Hyperlink"/>
@@ -16083,8 +16158,8 @@
         <w:t xml:space="preserve">.</w:t>
       </w:r>
     </w:p>
-    <w:bookmarkEnd w:id="60"/>
-    <w:bookmarkStart w:id="61" w:name="final-renders-and-presentation"/>
+    <w:bookmarkEnd w:id="63"/>
+    <w:bookmarkStart w:id="64" w:name="final-renders-and-presentation"/>
     <w:p>
       <w:pPr>
         <w:pStyle w:val="Heading2"/>
@@ -16305,8 +16380,8 @@
         <w:t xml:space="preserve">Credit for the reference photo and for every third-party material or prop, with its source.</w:t>
       </w:r>
     </w:p>
-    <w:bookmarkEnd w:id="61"/>
-    <w:bookmarkEnd w:id="62"/>
+    <w:bookmarkEnd w:id="64"/>
+    <w:bookmarkEnd w:id="65"/>
     <w:sectPr>
       <w:pgMar w:left="1152" w:right="1152" w:top="1152" w:bottom="1152"/>
     </w:sectPr>

</xml_diff>

<commit_message>
Add benchmark standards to the final render list
Value shot, alternative lighting mood, dimensioned kit sheet with scale figure,
trim vs unique overlay, tris counts on prop wireframes, RGB-mask variation,
foliage breakdown and process shots (17 items, was 11). Updates the app's
render checklist, plan source, Word/PDF plan and curriculum.

Co-Authored-By: Claude Opus 5.5 <noreply@anthropic.com>
Claude-Session: https://claude.ai/code/session_01BBz4kUXe8DBQeVKEZD3dJv
</commit_message>
<xml_diff>
--- a/docs/Derelict-Mill-Alley-Plan.docx
+++ b/docs/Derelict-Mill-Alley-Plan.docx
@@ -16233,7 +16233,7 @@
         <w:pStyle w:val="Compact"/>
       </w:pPr>
       <w:r>
-        <w:t xml:space="preserve">Modular kit sheet: every A to D piece laid out with IDs, plus a few walls assembled two different ways from the same pieces.</w:t>
+        <w:t xml:space="preserve">Value (greyscale) shot of Camera 1.</w:t>
       </w:r>
     </w:p>
     <w:p>
@@ -16245,7 +16245,7 @@
         <w:pStyle w:val="Compact"/>
       </w:pPr>
       <w:r>
-        <w:t xml:space="preserve">Kit assembly GIF: the right facade building up module by module.</w:t>
+        <w:t xml:space="preserve">Alternative lighting mood: Camera 1 at dusk or night.</w:t>
       </w:r>
     </w:p>
     <w:p>
@@ -16257,7 +16257,7 @@
         <w:pStyle w:val="Compact"/>
       </w:pPr>
       <w:r>
-        <w:t xml:space="preserve">Trim sheet and tiling material sheet: flat textures plus material spheres.</w:t>
+        <w:t xml:space="preserve">Modular kit sheet: every A to D piece laid out with IDs, module dimensions and a 180 cm scale figure, plus a few walls assembled two different ways from the same pieces.</w:t>
       </w:r>
     </w:p>
     <w:p>
@@ -16269,7 +16269,7 @@
         <w:pStyle w:val="Compact"/>
       </w:pPr>
       <w:r>
-        <w:t xml:space="preserve">Hero turntables: skybridge, chimney cap, loading doors (Marmoset).</w:t>
+        <w:t xml:space="preserve">Kit assembly GIF: the right facade building up module by module.</w:t>
       </w:r>
     </w:p>
     <w:p>
@@ -16281,7 +16281,7 @@
         <w:pStyle w:val="Compact"/>
       </w:pPr>
       <w:r>
-        <w:t xml:space="preserve">Wireframe and clay overlays of Camera 1.</w:t>
+        <w:t xml:space="preserve">Trim sheet and tiling material sheet: flat textures plus material spheres.</w:t>
       </w:r>
     </w:p>
     <w:p>
@@ -16293,7 +16293,7 @@
         <w:pStyle w:val="Compact"/>
       </w:pPr>
       <w:r>
-        <w:t xml:space="preserve">Vertex paint and decal breakdown: same wall, with and without.</w:t>
+        <w:t xml:space="preserve">Trim vs unique texture overlay: one facade coloured by texture type.</w:t>
       </w:r>
     </w:p>
     <w:p>
@@ -16305,7 +16305,79 @@
         <w:pStyle w:val="Compact"/>
       </w:pPr>
       <w:r>
+        <w:t xml:space="preserve">Hero turntables: skybridge, chimney cap, loading doors (Marmoset).</w:t>
+      </w:r>
+    </w:p>
+    <w:p>
+      <w:pPr>
+        <w:numPr>
+          <w:ilvl w:val="0"/>
+          <w:numId w:val="1025"/>
+        </w:numPr>
+        <w:pStyle w:val="Compact"/>
+      </w:pPr>
+      <w:r>
+        <w:t xml:space="preserve">Wireframe and clay overlays of Camera 1, plus a prop sheet wireframe with triangle counts.</w:t>
+      </w:r>
+    </w:p>
+    <w:p>
+      <w:pPr>
+        <w:numPr>
+          <w:ilvl w:val="0"/>
+          <w:numId w:val="1025"/>
+        </w:numPr>
+        <w:pStyle w:val="Compact"/>
+      </w:pPr>
+      <w:r>
+        <w:t xml:space="preserve">RGB-mask variation: one reusable prop shown in three variants from one mask.</w:t>
+      </w:r>
+    </w:p>
+    <w:p>
+      <w:pPr>
+        <w:numPr>
+          <w:ilvl w:val="0"/>
+          <w:numId w:val="1025"/>
+        </w:numPr>
+        <w:pStyle w:val="Compact"/>
+      </w:pPr>
+      <w:r>
+        <w:t xml:space="preserve">Foliage breakdown: leaf atlas, cards and the assembled ivy and buddleia.</w:t>
+      </w:r>
+    </w:p>
+    <w:p>
+      <w:pPr>
+        <w:numPr>
+          <w:ilvl w:val="0"/>
+          <w:numId w:val="1025"/>
+        </w:numPr>
+        <w:pStyle w:val="Compact"/>
+      </w:pPr>
+      <w:r>
+        <w:t xml:space="preserve">Vertex paint and decal breakdown: same wall, with and without.</w:t>
+      </w:r>
+    </w:p>
+    <w:p>
+      <w:pPr>
+        <w:numPr>
+          <w:ilvl w:val="0"/>
+          <w:numId w:val="1025"/>
+        </w:numPr>
+        <w:pStyle w:val="Compact"/>
+      </w:pPr>
+      <w:r>
         <w:t xml:space="preserve">Lighting-only pass.</w:t>
+      </w:r>
+    </w:p>
+    <w:p>
+      <w:pPr>
+        <w:numPr>
+          <w:ilvl w:val="0"/>
+          <w:numId w:val="1025"/>
+        </w:numPr>
+        <w:pStyle w:val="Compact"/>
+      </w:pPr>
+      <w:r>
+        <w:t xml:space="preserve">Process: reference board, composition reference and dated progress shots from each review.</w:t>
       </w:r>
     </w:p>
     <w:p>

</xml_diff>